<commit_message>
refactor: update profile and project details for clarity and accuracy
- Enhanced profile information with full name and title.
- Revised project descriptions to reflect current roles and responsibilities.
- Updated metrics and outcomes for projects to provide clearer impact statements.
- Improved service descriptions to better articulate capabilities.
- Refined skill groups and added new technologies to reflect current expertise.
- Adjusted layout and styling in various sections for better readability and presentation.
</commit_message>
<xml_diff>
--- a/public/pol-imbing-v3.docx
+++ b/public/pol-imbing-v3.docx
@@ -120,7 +120,15 @@
         <w:ind w:left="300"/>
       </w:pPr>
       <w:r>
-        <w:t>Testing: Vitest, Jest, Mocha, Chai</w:t>
+        <w:t xml:space="preserve">Testing: </w:t>
+      </w:r>
+      <w:proofErr w:type="spellStart"/>
+      <w:r>
+        <w:t>Vitest</w:t>
+      </w:r>
+      <w:proofErr w:type="spellEnd"/>
+      <w:r>
+        <w:t>, Jest, Mocha, Chai</w:t>
       </w:r>
     </w:p>
     <w:p>
@@ -138,7 +146,15 @@
         <w:ind w:left="300"/>
       </w:pPr>
       <w:r>
-        <w:t>Tools: Git, Docker, CI/CD, Vercel, AWS</w:t>
+        <w:t xml:space="preserve">Tools: Git, Docker, CI/CD, </w:t>
+      </w:r>
+      <w:proofErr w:type="spellStart"/>
+      <w:r>
+        <w:t>Vercel</w:t>
+      </w:r>
+      <w:proofErr w:type="spellEnd"/>
+      <w:r>
+        <w:t>, AWS</w:t>
       </w:r>
     </w:p>
     <w:p>
@@ -159,6 +175,8 @@
       <w:pPr>
         <w:pStyle w:val="Heading1"/>
         <w:rPr>
+          <w:color w:val="000080"/>
+          <w:spacing w:val="-2"/>
           <w:u w:val="none"/>
         </w:rPr>
       </w:pPr>
@@ -182,11 +200,11 @@
     </w:p>
     <w:p>
       <w:pPr>
-        <w:pStyle w:val="BodyText"/>
-        <w:spacing w:before="23"/>
-        <w:rPr>
-          <w:rFonts w:ascii="Arial"/>
-          <w:b/>
+        <w:pStyle w:val="Heading1"/>
+        <w:rPr>
+          <w:color w:val="000080"/>
+          <w:spacing w:val="-2"/>
+          <w:u w:val="none"/>
         </w:rPr>
       </w:pPr>
     </w:p>
@@ -206,7 +224,7 @@
           <w:sz w:val="18"/>
           <w:u w:val="single"/>
         </w:rPr>
-        <w:t>Eteam</w:t>
+        <w:t>YML Group</w:t>
       </w:r>
       <w:r>
         <w:rPr>
@@ -225,17 +243,16 @@
           <w:sz w:val="18"/>
           <w:u w:val="single"/>
         </w:rPr>
-        <w:t>Workforce</w:t>
+        <w:t>(</w:t>
       </w:r>
       <w:r>
         <w:rPr>
           <w:rFonts w:ascii="Arial" w:hAnsi="Arial"/>
           <w:b/>
-          <w:spacing w:val="-1"/>
           <w:sz w:val="18"/>
           <w:u w:val="single"/>
         </w:rPr>
-        <w:t xml:space="preserve"> </w:t>
+        <w:t>Feb</w:t>
       </w:r>
       <w:r>
         <w:rPr>
@@ -244,26 +261,16 @@
           <w:sz w:val="18"/>
           <w:u w:val="single"/>
         </w:rPr>
-        <w:t>Private Corporation</w:t>
+        <w:t xml:space="preserve"> 202</w:t>
       </w:r>
       <w:r>
         <w:rPr>
           <w:rFonts w:ascii="Arial" w:hAnsi="Arial"/>
           <w:b/>
-          <w:spacing w:val="-1"/>
           <w:sz w:val="18"/>
           <w:u w:val="single"/>
         </w:rPr>
-        <w:t xml:space="preserve"> </w:t>
-      </w:r>
-      <w:r>
-        <w:rPr>
-          <w:rFonts w:ascii="Arial" w:hAnsi="Arial"/>
-          <w:b/>
-          <w:sz w:val="18"/>
-          <w:u w:val="single"/>
-        </w:rPr>
-        <w:t>(November 2024</w:t>
+        <w:t>6</w:t>
       </w:r>
       <w:r>
         <w:rPr>
@@ -311,13 +318,9 @@
       </w:r>
       <w:r>
         <w:tab/>
-        <w:t xml:space="preserve">Senior React </w:t>
-      </w:r>
-      <w:r>
-        <w:rPr>
-          <w:spacing w:val="-2"/>
-        </w:rPr>
-        <w:t>Developer</w:t>
+      </w:r>
+      <w:r>
+        <w:t>AI Team Lead &amp; Solutions Architect</w:t>
       </w:r>
     </w:p>
     <w:p>
@@ -341,7 +344,7 @@
         <w:rPr>
           <w:spacing w:val="-2"/>
         </w:rPr>
-        <w:t>Healthcare</w:t>
+        <w:t>Financial Services</w:t>
       </w:r>
     </w:p>
     <w:p>
@@ -360,74 +363,31 @@
       </w:r>
       <w:r>
         <w:tab/>
-        <w:t>React,</w:t>
-      </w:r>
-      <w:r>
-        <w:rPr>
-          <w:spacing w:val="-7"/>
-        </w:rPr>
-        <w:t xml:space="preserve"> </w:t>
-      </w:r>
-      <w:r>
-        <w:t>Typescript,</w:t>
-      </w:r>
-      <w:r>
-        <w:rPr>
-          <w:spacing w:val="-4"/>
-        </w:rPr>
-        <w:t xml:space="preserve"> </w:t>
-      </w:r>
-      <w:r>
-        <w:t>Redux</w:t>
-      </w:r>
-      <w:r>
-        <w:rPr>
-          <w:spacing w:val="-4"/>
-        </w:rPr>
-        <w:t xml:space="preserve"> </w:t>
-      </w:r>
-      <w:r>
-        <w:t>tool</w:t>
-      </w:r>
-      <w:r>
-        <w:rPr>
-          <w:spacing w:val="-5"/>
-        </w:rPr>
-        <w:t xml:space="preserve"> </w:t>
-      </w:r>
-      <w:r>
-        <w:t>kit,</w:t>
-      </w:r>
-      <w:r>
-        <w:rPr>
-          <w:spacing w:val="-4"/>
-        </w:rPr>
-        <w:t xml:space="preserve"> </w:t>
-      </w:r>
-      <w:r>
-        <w:t>Tailwind,</w:t>
-      </w:r>
-      <w:r>
-        <w:rPr>
-          <w:spacing w:val="-4"/>
-        </w:rPr>
-        <w:t xml:space="preserve"> </w:t>
-      </w:r>
-      <w:r>
-        <w:t>Ant</w:t>
-      </w:r>
-      <w:r>
-        <w:rPr>
-          <w:spacing w:val="-4"/>
-        </w:rPr>
-        <w:t xml:space="preserve"> </w:t>
-      </w:r>
-      <w:r>
-        <w:rPr>
-          <w:spacing w:val="-2"/>
-        </w:rPr>
-        <w:t>Design,vitest</w:t>
-      </w:r>
+      </w:r>
+      <w:proofErr w:type="spellStart"/>
+      <w:r>
+        <w:t>NestJS</w:t>
+      </w:r>
+      <w:proofErr w:type="spellEnd"/>
+      <w:r>
+        <w:t xml:space="preserve">, React, Terraform, TypeScript, PostgreSQL, </w:t>
+      </w:r>
+      <w:proofErr w:type="spellStart"/>
+      <w:r>
+        <w:t>TypeORM</w:t>
+      </w:r>
+      <w:proofErr w:type="spellEnd"/>
+      <w:r>
+        <w:t>, Redis, MUI, Tailwind CSS, Redux Toolkit, Docker, Azure, GitHub Actions, Claude/Anthropic API</w:t>
+      </w:r>
+    </w:p>
+    <w:p>
+      <w:pPr>
+        <w:pStyle w:val="BodyText"/>
+        <w:tabs>
+          <w:tab w:val="left" w:pos="1740"/>
+        </w:tabs>
+      </w:pPr>
     </w:p>
     <w:p>
       <w:pPr>
@@ -458,17 +418,7 @@
         </w:numPr>
       </w:pPr>
       <w:r>
-        <w:t xml:space="preserve">Designed and developed high-quality React applications aligned with </w:t>
-      </w:r>
-      <w:r>
-        <w:rPr>
-          <w:b/>
-          <w:bCs/>
-        </w:rPr>
-        <w:t>FHIR R5 standards</w:t>
-      </w:r>
-      <w:r>
-        <w:t>, ensuring secure and seamless healthcare data exchange.</w:t>
+        <w:t>Lead a cross-functional engineering team as AI Team Lead and Solutions Architect, and serve as Scrum Master facilitating sprint planning, stand-ups, and retrospectives.</w:t>
       </w:r>
     </w:p>
     <w:p>
@@ -480,17 +430,7 @@
         </w:numPr>
       </w:pPr>
       <w:r>
-        <w:t xml:space="preserve">Collaborated closely with UI/UX designers, backend engineers, and QA specialists to deliver </w:t>
-      </w:r>
-      <w:r>
-        <w:rPr>
-          <w:b/>
-          <w:bCs/>
-        </w:rPr>
-        <w:t>robust, patient-centered solutions</w:t>
-      </w:r>
-      <w:r>
-        <w:t xml:space="preserve"> on schedule.</w:t>
+        <w:t>Architect and build AI-powered features using the Anthropic Claude API, including multimodal document-processing pipelines (PDF + image inputs) and latency optimization through prompt caching and model routing.</w:t>
       </w:r>
     </w:p>
     <w:p>
@@ -502,17 +442,23 @@
         </w:numPr>
       </w:pPr>
       <w:r>
-        <w:t xml:space="preserve">Implemented </w:t>
-      </w:r>
-      <w:r>
-        <w:rPr>
-          <w:b/>
-          <w:bCs/>
-        </w:rPr>
-        <w:t>reusable and testable components</w:t>
-      </w:r>
-      <w:r>
-        <w:t xml:space="preserve"> using React, Redux Toolkit, and TypeScript, which improved feature delivery time and reduced defects.</w:t>
+        <w:t xml:space="preserve">Design and develop full-stack features end-to-end with </w:t>
+      </w:r>
+      <w:proofErr w:type="spellStart"/>
+      <w:r>
+        <w:t>NestJS</w:t>
+      </w:r>
+      <w:proofErr w:type="spellEnd"/>
+      <w:r>
+        <w:t xml:space="preserve">, React, MUI, Tailwind CSS, and Redux Toolkit, backed by PostgreSQL and </w:t>
+      </w:r>
+      <w:proofErr w:type="spellStart"/>
+      <w:r>
+        <w:t>TypeORM</w:t>
+      </w:r>
+      <w:proofErr w:type="spellEnd"/>
+      <w:r>
+        <w:t>.</w:t>
       </w:r>
     </w:p>
     <w:p>
@@ -524,17 +470,7 @@
         </w:numPr>
       </w:pPr>
       <w:r>
-        <w:t xml:space="preserve">Optimized UI performance through </w:t>
-      </w:r>
-      <w:r>
-        <w:rPr>
-          <w:b/>
-          <w:bCs/>
-        </w:rPr>
-        <w:t>lazy loading, memoization, and dynamic imports</w:t>
-      </w:r>
-      <w:r>
-        <w:t>, resulting in faster load times and smoother user experience.</w:t>
+        <w:t>Harden application security through rate-limiting/throttling, Redis-based account lockout, and secure token-based password-reset flows.</w:t>
       </w:r>
     </w:p>
     <w:p>
@@ -546,17 +482,7 @@
         </w:numPr>
       </w:pPr>
       <w:r>
-        <w:t xml:space="preserve">Maintained </w:t>
-      </w:r>
-      <w:r>
-        <w:rPr>
-          <w:b/>
-          <w:bCs/>
-        </w:rPr>
-        <w:t>80%+ unit and integration test coverage</w:t>
-      </w:r>
-      <w:r>
-        <w:t>, strengthening reliability during production releases.</w:t>
+        <w:t>Build activity-tracking and audit-log systems to support transparency and compliance in a regulated domain.</w:t>
       </w:r>
     </w:p>
     <w:p>
@@ -568,7 +494,7 @@
         </w:numPr>
       </w:pPr>
       <w:r>
-        <w:t>Mentored junior developers through regular code reviews, knowledge sharing, and pair programming sessions.</w:t>
+        <w:t>Implement Redis caching layers to cut latency and improve application performance.</w:t>
       </w:r>
     </w:p>
     <w:p>
@@ -580,107 +506,166 @@
         </w:numPr>
       </w:pPr>
       <w:r>
-        <w:t>Actively participated in Agile sprint planning, retrospectives, and daily stand-ups to align development goals with business needs.</w:t>
-      </w:r>
-    </w:p>
-    <w:p>
-      <w:pPr>
-        <w:pStyle w:val="BodyText"/>
+        <w:t>Own cloud infrastructure and CI/CD end-to-end: Azure App Service &amp; VM deployments, Terraform, GitHub Actions pipelines (QA + production), Docker containerization, SSL/DNS setup, and production troubleshooting.</w:t>
+      </w:r>
+    </w:p>
+    <w:p>
+      <w:pPr>
+        <w:pStyle w:val="BodyText"/>
+        <w:numPr>
+          <w:ilvl w:val="0"/>
+          <w:numId w:val="24"/>
+        </w:numPr>
+      </w:pPr>
+      <w:r>
+        <w:t>Define QA strategy for AI features, including an accuracy test suite spanning 50+ scenarios and 440+ automated checks for non-deterministic AI outputs, plus structured E2E/manual test documentation.</w:t>
+      </w:r>
+    </w:p>
+    <w:p>
+      <w:pPr>
+        <w:pStyle w:val="BodyText"/>
+        <w:numPr>
+          <w:ilvl w:val="0"/>
+          <w:numId w:val="24"/>
+        </w:numPr>
+      </w:pPr>
+      <w:r>
+        <w:t>Engineer high-performance data pipelines, including bulk ETL of 2M+ records into PostgreSQL using parallelized processing and tuned bulk-load strategies.</w:t>
+      </w:r>
+    </w:p>
+    <w:p>
+      <w:pPr>
+        <w:pStyle w:val="Heading1"/>
+        <w:rPr>
+          <w:u w:val="none"/>
+        </w:rPr>
       </w:pPr>
     </w:p>
     <w:p>
       <w:pPr>
         <w:pStyle w:val="BodyText"/>
         <w:spacing w:before="23"/>
-      </w:pPr>
-    </w:p>
-    <w:p>
-      <w:pPr>
-        <w:pStyle w:val="Heading1"/>
-        <w:rPr>
-          <w:u w:val="none"/>
-        </w:rPr>
-      </w:pPr>
-      <w:r>
-        <w:t>Yempo</w:t>
-      </w:r>
-      <w:r>
-        <w:rPr>
-          <w:spacing w:val="-3"/>
-        </w:rPr>
-        <w:t xml:space="preserve"> </w:t>
-      </w:r>
-      <w:r>
-        <w:t>-</w:t>
-      </w:r>
-      <w:r>
-        <w:rPr>
-          <w:spacing w:val="-2"/>
-        </w:rPr>
-        <w:t xml:space="preserve"> </w:t>
-      </w:r>
-      <w:r>
-        <w:t>Your</w:t>
-      </w:r>
-      <w:r>
-        <w:rPr>
-          <w:spacing w:val="-3"/>
-        </w:rPr>
-        <w:t xml:space="preserve"> </w:t>
-      </w:r>
-      <w:r>
-        <w:t>Employees</w:t>
-      </w:r>
-      <w:r>
-        <w:rPr>
-          <w:spacing w:val="-2"/>
-        </w:rPr>
-        <w:t xml:space="preserve"> </w:t>
-      </w:r>
-      <w:r>
-        <w:t>Offshore</w:t>
-      </w:r>
-      <w:r>
-        <w:rPr>
-          <w:spacing w:val="-2"/>
-        </w:rPr>
-        <w:t xml:space="preserve"> </w:t>
-      </w:r>
-      <w:r>
-        <w:t>(November</w:t>
-      </w:r>
-      <w:r>
-        <w:rPr>
-          <w:spacing w:val="-3"/>
-        </w:rPr>
-        <w:t xml:space="preserve"> </w:t>
-      </w:r>
-      <w:r>
-        <w:t>2023</w:t>
-      </w:r>
-      <w:r>
-        <w:rPr>
-          <w:spacing w:val="-2"/>
-        </w:rPr>
-        <w:t xml:space="preserve"> </w:t>
-      </w:r>
-      <w:r>
-        <w:t>–</w:t>
-      </w:r>
-      <w:r>
-        <w:rPr>
-          <w:spacing w:val="45"/>
-        </w:rPr>
-        <w:t xml:space="preserve"> </w:t>
-      </w:r>
-      <w:r>
-        <w:t>October</w:t>
-      </w:r>
-      <w:r>
-        <w:rPr>
-          <w:spacing w:val="-2"/>
-        </w:rPr>
-        <w:t xml:space="preserve"> 2024)</w:t>
+        <w:rPr>
+          <w:rFonts w:ascii="Arial"/>
+          <w:b/>
+        </w:rPr>
+      </w:pPr>
+    </w:p>
+    <w:p>
+      <w:pPr>
+        <w:ind w:left="300"/>
+        <w:rPr>
+          <w:rFonts w:ascii="Arial" w:hAnsi="Arial"/>
+          <w:b/>
+          <w:sz w:val="18"/>
+        </w:rPr>
+      </w:pPr>
+      <w:proofErr w:type="spellStart"/>
+      <w:r>
+        <w:rPr>
+          <w:rFonts w:ascii="Arial" w:hAnsi="Arial"/>
+          <w:b/>
+          <w:sz w:val="18"/>
+          <w:u w:val="single"/>
+        </w:rPr>
+        <w:t>Eteam</w:t>
+      </w:r>
+      <w:proofErr w:type="spellEnd"/>
+      <w:r>
+        <w:rPr>
+          <w:rFonts w:ascii="Arial" w:hAnsi="Arial"/>
+          <w:b/>
+          <w:spacing w:val="-1"/>
+          <w:sz w:val="18"/>
+          <w:u w:val="single"/>
+        </w:rPr>
+        <w:t xml:space="preserve"> </w:t>
+      </w:r>
+      <w:r>
+        <w:rPr>
+          <w:rFonts w:ascii="Arial" w:hAnsi="Arial"/>
+          <w:b/>
+          <w:sz w:val="18"/>
+          <w:u w:val="single"/>
+        </w:rPr>
+        <w:t>Workforce</w:t>
+      </w:r>
+      <w:r>
+        <w:rPr>
+          <w:rFonts w:ascii="Arial" w:hAnsi="Arial"/>
+          <w:b/>
+          <w:spacing w:val="-1"/>
+          <w:sz w:val="18"/>
+          <w:u w:val="single"/>
+        </w:rPr>
+        <w:t xml:space="preserve"> </w:t>
+      </w:r>
+      <w:r>
+        <w:rPr>
+          <w:rFonts w:ascii="Arial" w:hAnsi="Arial"/>
+          <w:b/>
+          <w:sz w:val="18"/>
+          <w:u w:val="single"/>
+        </w:rPr>
+        <w:t>Private Corporation</w:t>
+      </w:r>
+      <w:r>
+        <w:rPr>
+          <w:rFonts w:ascii="Arial" w:hAnsi="Arial"/>
+          <w:b/>
+          <w:spacing w:val="-1"/>
+          <w:sz w:val="18"/>
+          <w:u w:val="single"/>
+        </w:rPr>
+        <w:t xml:space="preserve"> </w:t>
+      </w:r>
+      <w:r>
+        <w:rPr>
+          <w:rFonts w:ascii="Arial" w:hAnsi="Arial"/>
+          <w:b/>
+          <w:sz w:val="18"/>
+          <w:u w:val="single"/>
+        </w:rPr>
+        <w:t>(November 2024</w:t>
+      </w:r>
+      <w:r>
+        <w:rPr>
+          <w:rFonts w:ascii="Arial" w:hAnsi="Arial"/>
+          <w:b/>
+          <w:spacing w:val="-1"/>
+          <w:sz w:val="18"/>
+          <w:u w:val="single"/>
+        </w:rPr>
+        <w:t xml:space="preserve"> </w:t>
+      </w:r>
+      <w:r>
+        <w:rPr>
+          <w:rFonts w:ascii="Arial" w:hAnsi="Arial"/>
+          <w:b/>
+          <w:sz w:val="18"/>
+          <w:u w:val="single"/>
+        </w:rPr>
+        <w:t xml:space="preserve">– </w:t>
+      </w:r>
+      <w:r>
+        <w:rPr>
+          <w:rFonts w:ascii="Arial" w:hAnsi="Arial"/>
+          <w:b/>
+          <w:spacing w:val="-2"/>
+          <w:sz w:val="18"/>
+          <w:u w:val="single"/>
+        </w:rPr>
+        <w:t>January 2026</w:t>
+      </w:r>
+      <w:r>
+        <w:rPr>
+          <w:rFonts w:ascii="Arial" w:hAnsi="Arial"/>
+          <w:b/>
+          <w:spacing w:val="-2"/>
+          <w:sz w:val="18"/>
+          <w:u w:val="single"/>
+        </w:rPr>
+        <w:t>)</w:t>
       </w:r>
     </w:p>
     <w:p>
@@ -724,13 +709,12 @@
       </w:r>
       <w:r>
         <w:tab/>
-        <w:t xml:space="preserve">compliance data services and </w:t>
-      </w:r>
-      <w:r>
-        <w:rPr>
-          <w:spacing w:val="-2"/>
-        </w:rPr>
-        <w:t>technology</w:t>
+      </w:r>
+      <w:r>
+        <w:rPr>
+          <w:spacing w:val="-2"/>
+        </w:rPr>
+        <w:t>Healthcare</w:t>
       </w:r>
     </w:p>
     <w:p>
@@ -749,8 +733,422 @@
       </w:r>
       <w:r>
         <w:tab/>
+        <w:t>React,</w:t>
+      </w:r>
+      <w:r>
+        <w:rPr>
+          <w:spacing w:val="-7"/>
+        </w:rPr>
+        <w:t xml:space="preserve"> </w:t>
+      </w:r>
+      <w:r>
+        <w:t>Typescript,</w:t>
+      </w:r>
+      <w:r>
+        <w:rPr>
+          <w:spacing w:val="-4"/>
+        </w:rPr>
+        <w:t xml:space="preserve"> </w:t>
+      </w:r>
+      <w:r>
+        <w:t>Redux</w:t>
+      </w:r>
+      <w:r>
+        <w:rPr>
+          <w:spacing w:val="-4"/>
+        </w:rPr>
+        <w:t xml:space="preserve"> </w:t>
+      </w:r>
+      <w:r>
+        <w:t>tool</w:t>
+      </w:r>
+      <w:r>
+        <w:rPr>
+          <w:spacing w:val="-5"/>
+        </w:rPr>
+        <w:t xml:space="preserve"> </w:t>
+      </w:r>
+      <w:r>
+        <w:t>kit,</w:t>
+      </w:r>
+      <w:r>
+        <w:rPr>
+          <w:spacing w:val="-4"/>
+        </w:rPr>
+        <w:t xml:space="preserve"> </w:t>
+      </w:r>
+      <w:r>
+        <w:t>Tailwind,</w:t>
+      </w:r>
+      <w:r>
+        <w:rPr>
+          <w:spacing w:val="-4"/>
+        </w:rPr>
+        <w:t xml:space="preserve"> </w:t>
+      </w:r>
+      <w:r>
+        <w:t>Ant</w:t>
+      </w:r>
+      <w:r>
+        <w:rPr>
+          <w:spacing w:val="-4"/>
+        </w:rPr>
+        <w:t xml:space="preserve"> </w:t>
+      </w:r>
+      <w:proofErr w:type="spellStart"/>
+      <w:r>
+        <w:rPr>
+          <w:spacing w:val="-2"/>
+        </w:rPr>
+        <w:t>Design,vitest</w:t>
+      </w:r>
+      <w:proofErr w:type="spellEnd"/>
+    </w:p>
+    <w:p>
+      <w:pPr>
+        <w:pStyle w:val="BodyText"/>
+      </w:pPr>
+    </w:p>
+    <w:p>
+      <w:pPr>
+        <w:pStyle w:val="Heading1"/>
+        <w:rPr>
+          <w:u w:val="none"/>
+        </w:rPr>
+      </w:pPr>
+      <w:r>
+        <w:rPr>
+          <w:spacing w:val="-2"/>
+          <w:u w:val="none"/>
+        </w:rPr>
+        <w:t>Responsibilities</w:t>
+      </w:r>
+    </w:p>
+    <w:p>
+      <w:pPr>
+        <w:pStyle w:val="BodyText"/>
+        <w:numPr>
+          <w:ilvl w:val="0"/>
+          <w:numId w:val="24"/>
+        </w:numPr>
+      </w:pPr>
+      <w:r>
+        <w:t xml:space="preserve">Designed and developed high-quality React applications aligned with </w:t>
+      </w:r>
+      <w:r>
+        <w:rPr>
+          <w:b/>
+          <w:bCs/>
+        </w:rPr>
+        <w:t>FHIR R5 standards</w:t>
+      </w:r>
+      <w:r>
+        <w:t>, ensuring secure and seamless healthcare data exchange.</w:t>
+      </w:r>
+    </w:p>
+    <w:p>
+      <w:pPr>
+        <w:pStyle w:val="BodyText"/>
+        <w:numPr>
+          <w:ilvl w:val="0"/>
+          <w:numId w:val="24"/>
+        </w:numPr>
+      </w:pPr>
+      <w:r>
+        <w:t xml:space="preserve">Collaborated closely with UI/UX designers, backend engineers, and QA specialists to deliver </w:t>
+      </w:r>
+      <w:r>
+        <w:rPr>
+          <w:b/>
+          <w:bCs/>
+        </w:rPr>
+        <w:t>robust, patient-centered solutions</w:t>
+      </w:r>
+      <w:r>
+        <w:t xml:space="preserve"> on schedule.</w:t>
+      </w:r>
+    </w:p>
+    <w:p>
+      <w:pPr>
+        <w:pStyle w:val="BodyText"/>
+        <w:numPr>
+          <w:ilvl w:val="0"/>
+          <w:numId w:val="24"/>
+        </w:numPr>
+      </w:pPr>
+      <w:r>
+        <w:t xml:space="preserve">Implemented </w:t>
+      </w:r>
+      <w:r>
+        <w:rPr>
+          <w:b/>
+          <w:bCs/>
+        </w:rPr>
+        <w:t>reusable and testable components</w:t>
+      </w:r>
+      <w:r>
+        <w:t xml:space="preserve"> using React, Redux Toolkit, and TypeScript, which improved feature delivery time and reduced defects.</w:t>
+      </w:r>
+    </w:p>
+    <w:p>
+      <w:pPr>
+        <w:pStyle w:val="BodyText"/>
+        <w:numPr>
+          <w:ilvl w:val="0"/>
+          <w:numId w:val="24"/>
+        </w:numPr>
+      </w:pPr>
+      <w:r>
+        <w:t xml:space="preserve">Optimized UI performance through </w:t>
+      </w:r>
+      <w:r>
+        <w:rPr>
+          <w:b/>
+          <w:bCs/>
+        </w:rPr>
+        <w:t xml:space="preserve">lazy loading, </w:t>
+      </w:r>
+      <w:proofErr w:type="spellStart"/>
+      <w:r>
+        <w:rPr>
+          <w:b/>
+          <w:bCs/>
+        </w:rPr>
+        <w:t>memoization</w:t>
+      </w:r>
+      <w:proofErr w:type="spellEnd"/>
+      <w:r>
+        <w:rPr>
+          <w:b/>
+          <w:bCs/>
+        </w:rPr>
+        <w:t>, and dynamic imports</w:t>
+      </w:r>
+      <w:r>
+        <w:t>, resulting in faster load times and smoother user experience.</w:t>
+      </w:r>
+    </w:p>
+    <w:p>
+      <w:pPr>
+        <w:pStyle w:val="BodyText"/>
+        <w:numPr>
+          <w:ilvl w:val="0"/>
+          <w:numId w:val="24"/>
+        </w:numPr>
+      </w:pPr>
+      <w:r>
+        <w:lastRenderedPageBreak/>
+        <w:t xml:space="preserve">Maintained </w:t>
+      </w:r>
+      <w:r>
+        <w:rPr>
+          <w:b/>
+          <w:bCs/>
+        </w:rPr>
+        <w:t>80%+ unit and integration test coverage</w:t>
+      </w:r>
+      <w:r>
+        <w:t>, strengthening reliability during production releases.</w:t>
+      </w:r>
+    </w:p>
+    <w:p>
+      <w:pPr>
+        <w:pStyle w:val="BodyText"/>
+        <w:numPr>
+          <w:ilvl w:val="0"/>
+          <w:numId w:val="24"/>
+        </w:numPr>
+      </w:pPr>
+      <w:r>
+        <w:t>Mentored junior developers through regular code reviews, knowledge sharing, and pair programming sessions.</w:t>
+      </w:r>
+    </w:p>
+    <w:p>
+      <w:pPr>
+        <w:pStyle w:val="BodyText"/>
+        <w:numPr>
+          <w:ilvl w:val="0"/>
+          <w:numId w:val="24"/>
+        </w:numPr>
+      </w:pPr>
+      <w:r>
+        <w:t>Actively participated in Agile sprint planning, retrospectives, and daily stand-ups to align development goals with business needs.</w:t>
+      </w:r>
+    </w:p>
+    <w:p>
+      <w:pPr>
+        <w:pStyle w:val="BodyText"/>
+      </w:pPr>
+    </w:p>
+    <w:p>
+      <w:pPr>
+        <w:pStyle w:val="BodyText"/>
+        <w:spacing w:before="23"/>
+      </w:pPr>
+    </w:p>
+    <w:p>
+      <w:pPr>
+        <w:pStyle w:val="Heading1"/>
+        <w:rPr>
+          <w:u w:val="none"/>
+        </w:rPr>
+      </w:pPr>
+      <w:proofErr w:type="spellStart"/>
+      <w:r>
+        <w:t>Yempo</w:t>
+      </w:r>
+      <w:proofErr w:type="spellEnd"/>
+      <w:r>
+        <w:rPr>
+          <w:spacing w:val="-3"/>
+        </w:rPr>
+        <w:t xml:space="preserve"> </w:t>
+      </w:r>
+      <w:r>
+        <w:t>-</w:t>
+      </w:r>
+      <w:r>
+        <w:rPr>
+          <w:spacing w:val="-2"/>
+        </w:rPr>
+        <w:t xml:space="preserve"> </w:t>
+      </w:r>
+      <w:r>
+        <w:t>Your</w:t>
+      </w:r>
+      <w:r>
+        <w:rPr>
+          <w:spacing w:val="-3"/>
+        </w:rPr>
+        <w:t xml:space="preserve"> </w:t>
+      </w:r>
+      <w:r>
+        <w:t>Employees</w:t>
+      </w:r>
+      <w:r>
+        <w:rPr>
+          <w:spacing w:val="-2"/>
+        </w:rPr>
+        <w:t xml:space="preserve"> </w:t>
+      </w:r>
+      <w:r>
+        <w:t>Offshore</w:t>
+      </w:r>
+      <w:r>
+        <w:rPr>
+          <w:spacing w:val="-2"/>
+        </w:rPr>
+        <w:t xml:space="preserve"> </w:t>
+      </w:r>
+      <w:r>
+        <w:t>(November</w:t>
+      </w:r>
+      <w:r>
+        <w:rPr>
+          <w:spacing w:val="-3"/>
+        </w:rPr>
+        <w:t xml:space="preserve"> </w:t>
+      </w:r>
+      <w:r>
+        <w:t>2023</w:t>
+      </w:r>
+      <w:r>
+        <w:rPr>
+          <w:spacing w:val="-2"/>
+        </w:rPr>
+        <w:t xml:space="preserve"> </w:t>
+      </w:r>
+      <w:r>
+        <w:t>–</w:t>
+      </w:r>
+      <w:r>
+        <w:rPr>
+          <w:spacing w:val="45"/>
+        </w:rPr>
+        <w:t xml:space="preserve"> </w:t>
+      </w:r>
+      <w:r>
+        <w:t>October</w:t>
+      </w:r>
+      <w:r>
+        <w:rPr>
+          <w:spacing w:val="-2"/>
+        </w:rPr>
+        <w:t xml:space="preserve"> 2024)</w:t>
+      </w:r>
+    </w:p>
+    <w:p>
+      <w:pPr>
+        <w:pStyle w:val="BodyText"/>
+        <w:tabs>
+          <w:tab w:val="left" w:pos="1740"/>
+        </w:tabs>
+        <w:ind w:left="300"/>
+      </w:pPr>
+      <w:r>
+        <w:rPr>
+          <w:spacing w:val="-2"/>
+        </w:rPr>
+        <w:t>Role:</w:t>
+      </w:r>
+      <w:r>
+        <w:tab/>
+        <w:t xml:space="preserve">Senior React </w:t>
+      </w:r>
+      <w:r>
+        <w:rPr>
+          <w:spacing w:val="-2"/>
+        </w:rPr>
+        <w:t>Developer</w:t>
+      </w:r>
+    </w:p>
+    <w:p>
+      <w:pPr>
+        <w:pStyle w:val="BodyText"/>
+        <w:tabs>
+          <w:tab w:val="left" w:pos="1740"/>
+        </w:tabs>
+        <w:ind w:left="300"/>
+      </w:pPr>
+      <w:r>
+        <w:rPr>
+          <w:spacing w:val="-2"/>
+        </w:rPr>
+        <w:t>Domain:</w:t>
+      </w:r>
+      <w:r>
+        <w:tab/>
+        <w:t xml:space="preserve">compliance data services and </w:t>
+      </w:r>
+      <w:r>
+        <w:rPr>
+          <w:spacing w:val="-2"/>
+        </w:rPr>
+        <w:t>technology</w:t>
+      </w:r>
+    </w:p>
+    <w:p>
+      <w:pPr>
+        <w:pStyle w:val="BodyText"/>
+        <w:tabs>
+          <w:tab w:val="left" w:pos="1740"/>
+        </w:tabs>
+        <w:ind w:left="300"/>
+      </w:pPr>
+      <w:r>
+        <w:rPr>
+          <w:spacing w:val="-2"/>
+        </w:rPr>
+        <w:t>Technology:</w:t>
+      </w:r>
+      <w:r>
+        <w:tab/>
+      </w:r>
+      <w:proofErr w:type="spellStart"/>
+      <w:r>
         <w:t>React,Typescript,Redux</w:t>
       </w:r>
+      <w:proofErr w:type="spellEnd"/>
       <w:r>
         <w:rPr>
           <w:spacing w:val="-6"/>
@@ -793,12 +1191,14 @@
         </w:rPr>
         <w:t xml:space="preserve"> </w:t>
       </w:r>
+      <w:proofErr w:type="spellStart"/>
       <w:r>
         <w:rPr>
           <w:spacing w:val="-2"/>
         </w:rPr>
         <w:t>Design,vitest</w:t>
       </w:r>
+      <w:proofErr w:type="spellEnd"/>
     </w:p>
     <w:p>
       <w:pPr>
@@ -1205,8 +1605,12 @@
       </w:r>
       <w:r>
         <w:tab/>
+      </w:r>
+      <w:proofErr w:type="spellStart"/>
+      <w:r>
         <w:t>React,Typescript,Redux</w:t>
       </w:r>
+      <w:proofErr w:type="spellEnd"/>
       <w:r>
         <w:rPr>
           <w:spacing w:val="-2"/>
@@ -1258,12 +1662,14 @@
         </w:rPr>
         <w:t xml:space="preserve"> </w:t>
       </w:r>
+      <w:proofErr w:type="spellStart"/>
       <w:r>
         <w:rPr>
           <w:spacing w:val="-2"/>
         </w:rPr>
         <w:t>component,vitest</w:t>
       </w:r>
+      <w:proofErr w:type="spellEnd"/>
     </w:p>
     <w:p>
       <w:pPr>
@@ -1572,20 +1978,37 @@
         <w:tab/>
         <w:t xml:space="preserve">Travel and Tourism Technology </w:t>
       </w:r>
-      <w:r>
-        <w:rPr>
-          <w:spacing w:val="-2"/>
-          <w:sz w:val="18"/>
-        </w:rPr>
-        <w:t>Technology:</w:t>
+      <w:proofErr w:type="spellStart"/>
+      <w:r>
+        <w:rPr>
+          <w:spacing w:val="-2"/>
+          <w:sz w:val="18"/>
+        </w:rPr>
+        <w:t>Technology</w:t>
+      </w:r>
+      <w:proofErr w:type="spellEnd"/>
+      <w:r>
+        <w:rPr>
+          <w:spacing w:val="-2"/>
+          <w:sz w:val="18"/>
+        </w:rPr>
+        <w:t>:</w:t>
       </w:r>
       <w:r>
         <w:rPr>
           <w:sz w:val="18"/>
         </w:rPr>
         <w:tab/>
-        <w:t>Node.js, Nest.js , Typescript,Postgres</w:t>
-      </w:r>
+        <w:t xml:space="preserve">Node.js, Nest.js , </w:t>
+      </w:r>
+      <w:proofErr w:type="spellStart"/>
+      <w:r>
+        <w:rPr>
+          <w:sz w:val="18"/>
+        </w:rPr>
+        <w:t>Typescript,Postgres</w:t>
+      </w:r>
+      <w:proofErr w:type="spellEnd"/>
     </w:p>
     <w:p>
       <w:pPr>
@@ -1947,9 +2370,11 @@
           <w:u w:val="none"/>
         </w:rPr>
       </w:pPr>
+      <w:proofErr w:type="spellStart"/>
       <w:r>
         <w:t>RadioWealth</w:t>
       </w:r>
+      <w:proofErr w:type="spellEnd"/>
       <w:r>
         <w:rPr>
           <w:spacing w:val="-3"/>
@@ -2130,8 +2555,13 @@
         </w:rPr>
         <w:t xml:space="preserve"> </w:t>
       </w:r>
-      <w:r>
-        <w:t>TypeORM,</w:t>
+      <w:proofErr w:type="spellStart"/>
+      <w:r>
+        <w:t>TypeORM</w:t>
+      </w:r>
+      <w:proofErr w:type="spellEnd"/>
+      <w:r>
+        <w:t>,</w:t>
       </w:r>
       <w:r>
         <w:rPr>
@@ -2185,7 +2615,15 @@
         <w:t xml:space="preserve"> </w:t>
       </w:r>
       <w:r>
-        <w:t>Entity Framework, Python, Flask, Flask, Flask SQLAlchemy, PostgreSQL</w:t>
+        <w:t xml:space="preserve">Entity Framework, Python, Flask, Flask, Flask </w:t>
+      </w:r>
+      <w:proofErr w:type="spellStart"/>
+      <w:r>
+        <w:t>SQLAlchemy</w:t>
+      </w:r>
+      <w:proofErr w:type="spellEnd"/>
+      <w:r>
+        <w:t>, PostgreSQL</w:t>
       </w:r>
     </w:p>
     <w:p>
@@ -2325,7 +2763,25 @@
           <w:bCs/>
           <w:sz w:val="18"/>
         </w:rPr>
-        <w:t>Node.js, TypeORM, and MS SQL</w:t>
+        <w:t xml:space="preserve">Node.js, </w:t>
+      </w:r>
+      <w:proofErr w:type="spellStart"/>
+      <w:r>
+        <w:rPr>
+          <w:b/>
+          <w:bCs/>
+          <w:sz w:val="18"/>
+        </w:rPr>
+        <w:t>TypeORM</w:t>
+      </w:r>
+      <w:proofErr w:type="spellEnd"/>
+      <w:r>
+        <w:rPr>
+          <w:b/>
+          <w:bCs/>
+          <w:sz w:val="18"/>
+        </w:rPr>
+        <w:t>, and MS SQL</w:t>
       </w:r>
       <w:r>
         <w:rPr>
@@ -2435,9 +2891,11 @@
           <w:u w:val="none"/>
         </w:rPr>
       </w:pPr>
+      <w:proofErr w:type="spellStart"/>
       <w:r>
         <w:t>Tektos</w:t>
       </w:r>
+      <w:proofErr w:type="spellEnd"/>
       <w:r>
         <w:rPr>
           <w:spacing w:val="-3"/>
@@ -2622,6 +3080,7 @@
           <w:sz w:val="18"/>
         </w:rPr>
       </w:pPr>
+      <w:proofErr w:type="spellStart"/>
       <w:r>
         <w:rPr>
           <w:rFonts w:ascii="Arial" w:hAnsi="Arial"/>
@@ -2631,6 +3090,7 @@
         </w:rPr>
         <w:t>Infotouch</w:t>
       </w:r>
+      <w:proofErr w:type="spellEnd"/>
       <w:r>
         <w:rPr>
           <w:rFonts w:ascii="Arial" w:hAnsi="Arial"/>
@@ -2996,7 +3456,15 @@
         <w:pStyle w:val="Heading2"/>
       </w:pPr>
       <w:r>
-        <w:t xml:space="preserve">Beginners guide to HL7 Standards &amp; HealthIT </w:t>
+        <w:t xml:space="preserve">Beginners guide to HL7 Standards &amp; </w:t>
+      </w:r>
+      <w:proofErr w:type="spellStart"/>
+      <w:r>
+        <w:t>HealthIT</w:t>
+      </w:r>
+      <w:proofErr w:type="spellEnd"/>
+      <w:r>
+        <w:t xml:space="preserve"> </w:t>
       </w:r>
       <w:r>
         <w:rPr>
@@ -3121,16 +3589,7 @@
           <w:spacing w:val="-4"/>
           <w:sz w:val="18"/>
         </w:rPr>
-        <w:t>202</w:t>
-      </w:r>
-      <w:r>
-        <w:rPr>
-          <w:rFonts w:ascii="Arial"/>
-          <w:i/>
-          <w:spacing w:val="-4"/>
-          <w:sz w:val="18"/>
-        </w:rPr>
-        <w:t>3</w:t>
+        <w:t>2023</w:t>
       </w:r>
     </w:p>
     <w:p>
@@ -3272,7 +3731,7 @@
         </mc:Choice>
         <mc:Fallback>
           <w:pict>
-            <v:shape w14:anchorId="551066DA" id="Graphic 1" o:spid="_x0000_s1026" style="position:absolute;margin-left:51pt;margin-top:129.5pt;width:502pt;height:.1pt;z-index:-15839232;visibility:visible;mso-wrap-style:square;mso-wrap-distance-left:0;mso-wrap-distance-top:0;mso-wrap-distance-right:0;mso-wrap-distance-bottom:0;mso-position-horizontal:absolute;mso-position-horizontal-relative:page;mso-position-vertical:absolute;mso-position-vertical-relative:page;v-text-anchor:top" coordsize="6375400,1270" o:gfxdata="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" path="m,l6375396,e" filled="f" strokeweight=".35267mm">
+            <v:shape w14:anchorId="125C17D4" id="Graphic 1" o:spid="_x0000_s1026" style="position:absolute;margin-left:51pt;margin-top:129.5pt;width:502pt;height:.1pt;z-index:-15839232;visibility:visible;mso-wrap-style:square;mso-wrap-distance-left:0;mso-wrap-distance-top:0;mso-wrap-distance-right:0;mso-wrap-distance-bottom:0;mso-position-horizontal:absolute;mso-position-horizontal-relative:page;mso-position-vertical:absolute;mso-position-vertical-relative:page;v-text-anchor:top" coordsize="6375400,1270" o:gfxdata="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" path="m,l6375396,e" filled="f" strokeweight=".35267mm">
               <v:path arrowok="t"/>
               <w10:wrap anchorx="page" anchory="page"/>
             </v:shape>
@@ -7206,6 +7665,7 @@
   <w:style w:type="paragraph" w:default="1" w:styleId="Normal">
     <w:name w:val="Normal"/>
     <w:qFormat/>
+    <w:rsid w:val="00BA41EC"/>
     <w:rPr>
       <w:rFonts w:ascii="Arial MT" w:eastAsia="Arial MT" w:hAnsi="Arial MT" w:cs="Arial MT"/>
     </w:rPr>
@@ -7362,6 +7822,19 @@
       <w:iCs/>
       <w:sz w:val="18"/>
       <w:szCs w:val="18"/>
+    </w:rPr>
+  </w:style>
+  <w:style w:type="paragraph" w:styleId="NormalWeb">
+    <w:name w:val="Normal (Web)"/>
+    <w:basedOn w:val="Normal"/>
+    <w:uiPriority w:val="99"/>
+    <w:semiHidden/>
+    <w:unhideWhenUsed/>
+    <w:rsid w:val="00BA41EC"/>
+    <w:rPr>
+      <w:rFonts w:ascii="Times New Roman" w:hAnsi="Times New Roman" w:cs="Times New Roman"/>
+      <w:sz w:val="24"/>
+      <w:szCs w:val="24"/>
     </w:rPr>
   </w:style>
 </w:styles>

</xml_diff>